<commit_message>
Correct department name on cover letter and title page
Co-Authored-By: Claude Sonnet 5.5 <noreply@anthropic.com>
Claude-Session: https://claude.ai/code/session_01HqETZvN3rK1ZqRBAbAYQWS
</commit_message>
<xml_diff>
--- a/dynamic_bertrand/submission/02_Title_Page.docx
+++ b/dynamic_bertrand/submission/02_Title_Page.docx
@@ -59,7 +59,7 @@
         <w:rPr>
           <w:rFonts w:ascii="Times New Roman" w:hAnsi="Times New Roman"/>
         </w:rPr>
-        <w:t xml:space="preserve">Ook Lee, Department of Information Systems, Hanyang University, Seoul, Korea. </w:t>
+        <w:t xml:space="preserve">Ook Lee, Department of Information System, Hanyang University, Seoul, Korea. </w:t>
       </w:r>
       <w:r>
         <w:rPr>
@@ -101,7 +101,7 @@
         <w:rPr>
           <w:rFonts w:ascii="Times New Roman" w:hAnsi="Times New Roman"/>
         </w:rPr>
-        <w:t xml:space="preserve">Ook Lee, Department of Information Systems, Hanyang University, Seoul, Korea. E-mail: ooklee@hanyang.ac.kr. </w:t>
+        <w:t xml:space="preserve">Ook Lee, Department of Information System, Hanyang University, Seoul, Korea. E-mail: ooklee@hanyang.ac.kr. </w:t>
       </w:r>
       <w:r>
         <w:rPr>

</xml_diff>